<commit_message>
Update Week 7/8 reports for the durable-execution addition
Test count/coverage references (474 -> 482, 99.4% -> 99.3%) and the
orchestration directory description now reflect the ADR-0015 work added
after these reports were first drafted; Week 7 also gets a sentence on
the new opt-in checkpointing layer, and Week 8 lists the new optional
langgraph-checkpoint-sqlite dependency.
</commit_message>
<xml_diff>
--- a/docs/weekly-submissions/Week7_Final_Report.docx
+++ b/docs/weekly-submissions/Week7_Final_Report.docx
@@ -229,7 +229,7 @@
           <w:rFonts w:ascii="Times New Roman" w:hAnsi="Times New Roman"/>
           <w:sz w:val="24"/>
         </w:rPr>
-        <w:t>TrustResume checks every claim in a generated resume against a candidate's own evidence before showing it to anyone. This is a direct response to the risk that an unconstrained LLM embellishes a resume. This report covers a from-scratch reimplementation of an earlier pydantic-ai/Qdrant capstone on LangChain, LangGraph, and ChromaDB: six agents coordinated by a quality loop that rewrites a draft up to three times against a Trust gate and an ATS gate. An offline evaluation harness scores the system itself: hybrid retrieval reaches recall@8 1.000/MRR 0.938, and the Trust Harness, after a calibration fix documented here, classifies claims at accuracy/macro-F1 0.833 (up from 0.500/0.489) with zero dangerous false-pass errors either way. A 474-test suite holds 99.4% coverage, and four real Bedrock-hosted runs show the thesis directly: the system would rather fail a candidate than invent experience they lack. The report closes with the challenges this build surfaced and the work still open.</w:t>
+        <w:t>TrustResume checks every claim in a generated resume against a candidate's own evidence before showing it to anyone. This is a direct response to the risk that an unconstrained LLM embellishes a resume. This report covers a from-scratch reimplementation of an earlier pydantic-ai/Qdrant capstone on LangChain, LangGraph, and ChromaDB: six agents coordinated by a quality loop that rewrites a draft up to three times against a Trust gate and an ATS gate. An offline evaluation harness scores the system itself: hybrid retrieval reaches recall@8 1.000/MRR 0.938, and the Trust Harness, after a calibration fix documented here, classifies claims at accuracy/macro-F1 0.833 (up from 0.500/0.489) with zero dangerous false-pass errors either way. A 482-test suite holds 99.3% coverage, and four real Bedrock-hosted runs show the thesis directly: the system would rather fail a candidate than invent experience they lack. The report closes with the challenges this build surfaced and the work still open.</w:t>
       </w:r>
     </w:p>
     <w:p>
@@ -388,7 +388,7 @@
           <w:rFonts w:ascii="Times New Roman" w:hAnsi="Times New Roman"/>
           <w:sz w:val="24"/>
         </w:rPr>
-        <w:t>Storage stayed on SQLite plus ChromaDB rather than Qdrant (ADR-0001), every search scoped by a user_id filter. Retrieval is hybrid (ADR-0010): vector and keyword hits fuse by Reciprocal Rank Fusion, since cosine similarity and BM25 rank aren't comparable. One catches a paraphrase sharing no vocabulary with its evidence; the other catches an exact product name the embedder treats as interchangeable with a competitor. Temperature is pinned to 0 (ADR-0013), since the headline claim is a deterministic, code-computed Trust score; models are tiered by role (extraction/writer/verifier) so a cheap model fills a schema while a stronger one adjudicates trust. Every route resolves its caller from a request header (ADR-0014) instead of one hardcoded demo user, making the isolation boundary testable rather than merely asserted.</w:t>
+        <w:t>Storage stayed on SQLite plus ChromaDB rather than Qdrant (ADR-0001), every search scoped by a user_id filter. Retrieval is hybrid (ADR-0010): vector and keyword hits fuse by Reciprocal Rank Fusion, since cosine similarity and BM25 rank aren't comparable. One catches a paraphrase sharing no vocabulary with its evidence; the other catches an exact product name the embedder treats as interchangeable with a competitor. Temperature is pinned to 0 (ADR-0013), since the headline claim is a deterministic, code-computed Trust score; models are tiered by role (extraction/writer/verifier) so a cheap model fills a schema while a stronger one adjudicates trust. Every route resolves its caller from a request header (ADR-0014) instead of one hardcoded demo user, making the isolation boundary testable rather than merely asserted. An opt-in checkpointing layer (ADR-0015) demonstrates LangGraph's durable-execution capability: a crashed run resumes from its last completed node instead of re-paying for already-completed LLM calls, off by default so the pipeline above is unchanged unless a caller opts in.</w:t>
       </w:r>
     </w:p>
     <w:p>
@@ -480,7 +480,7 @@
           <w:rFonts w:ascii="Times New Roman" w:hAnsi="Times New Roman"/>
           <w:sz w:val="24"/>
         </w:rPr>
-        <w:t>The suite holds 474 passing tests (9 live-marked tests deselected by default) at 99.4% coverage against a 95% gate. CI runs lint, a format check, strict mypy, and the full suite on Python 3.11 and 3.13 from a locked dependency file on every push and pull request.</w:t>
+        <w:t>The suite holds 482 passing tests (9 live-marked tests deselected by default) at 99.3% coverage against a 95% gate. CI runs lint, a format check, strict mypy, and the full suite on Python 3.11 and 3.13 from a locked dependency file on every push and pull request.</w:t>
       </w:r>
     </w:p>
     <w:p>

</xml_diff>